<commit_message>
Le gabarit livre porte le logo XSPro des l'installation
Grave dans resources/exemple/Gabarit.docx plutot que pose au premier
lancement : un poste neuf reçoit un gabarit deja complet, sans passer par
Word. `npm run logo:gabarit` refait l'operation si le logo change.

La meme image sert d'icone a l'application, qui portait encore celle
d'Electron par defaut.

SetLogo.ps1 rend les chemins absolus : Word les resolvait depuis son propre
dossier de travail, ce qui faisait echouer tout appel en chemin relatif.

Co-Authored-By: Claude Opus 5 <noreply@anthropic.com>
</commit_message>
<xml_diff>
--- a/resources/exemple/Gabarit.docx
+++ b/resources/exemple/Gabarit.docx
@@ -20,7 +20,6 @@
       <w:pgNumType w:start="0"/>
       <w:cols w:space="283"/>
       <w:noEndnote/>
-      <w:titlePg/>
       <w:docGrid w:linePitch="299"/>
     </w:sectPr>
   </w:body>
@@ -283,7 +282,51 @@
       <w:jc w:val="right"/>
     </w:pPr>
     <w:r>
-      <w:t xml:space="preserve">   </w:t>
+      <w:rPr>
+        <w:noProof/>
+        <w:lang w:eastAsia="fr-FR"/>
+      </w:rPr>
+      <w:drawing>
+        <wp:inline distT="0" distB="0" distL="0" distR="0" wp14:anchorId="55F5EE50" wp14:editId="719FAA25">
+          <wp:extent cx="504000" cy="504000"/>
+          <wp:effectExtent l="0" t="0" r="0" b="0"/>
+          <wp:docPr id="1" name="Image 1"/>
+          <wp:cNvGraphicFramePr>
+            <a:graphicFrameLocks xmlns:a="http://schemas.openxmlformats.org/drawingml/2006/main" noChangeAspect="1"/>
+          </wp:cNvGraphicFramePr>
+          <a:graphic xmlns:a="http://schemas.openxmlformats.org/drawingml/2006/main">
+            <a:graphicData uri="http://schemas.openxmlformats.org/drawingml/2006/picture">
+              <pic:pic xmlns:pic="http://schemas.openxmlformats.org/drawingml/2006/picture">
+                <pic:nvPicPr>
+                  <pic:cNvPr id="1" name=""/>
+                  <pic:cNvPicPr/>
+                </pic:nvPicPr>
+                <pic:blipFill>
+                  <a:blip r:embed="rId1">
+                    <a:extLst>
+                      <a:ext uri="{28A0092B-C50C-407E-A947-70E740481C1C}">
+                        <a14:useLocalDpi xmlns:a14="http://schemas.microsoft.com/office/drawing/2010/main" val="0"/>
+                      </a:ext>
+                    </a:extLst>
+                  </a:blip>
+                  <a:stretch>
+                    <a:fillRect/>
+                  </a:stretch>
+                </pic:blipFill>
+                <pic:spPr>
+                  <a:xfrm>
+                    <a:off x="0" y="0"/>
+                    <a:ext cx="504000" cy="504000"/>
+                  </a:xfrm>
+                  <a:prstGeom prst="rect">
+                    <a:avLst/>
+                  </a:prstGeom>
+                </pic:spPr>
+              </pic:pic>
+            </a:graphicData>
+          </a:graphic>
+        </wp:inline>
+      </w:drawing>
     </w:r>
   </w:p>
 </w:hdr>
@@ -4388,7 +4431,7 @@
 </file>
 
 <file path=customXml/itemProps2.xml><?xml version="1.0" encoding="utf-8"?>
-<ds:datastoreItem xmlns:ds="http://schemas.openxmlformats.org/officeDocument/2006/customXml" ds:itemID="{63C07E05-11D2-4AB9-B4C2-433BD1F127CE}">
+<ds:datastoreItem xmlns:ds="http://schemas.openxmlformats.org/officeDocument/2006/customXml" ds:itemID="{34AC0C26-CE0F-40F6-A6EE-47A48F365A66}">
   <ds:schemaRefs>
     <ds:schemaRef ds:uri="http://schemas.openxmlformats.org/officeDocument/2006/bibliography"/>
   </ds:schemaRefs>

</xml_diff>

<commit_message>
Plus de pages blanches entre les chapitres
Deux causes, l'une dans le script, l'autre dans les contenus.

Le saut de page etait insere en dur avant chaque titre demandant une nouvelle
page. Il est remplace par l'attribut "saut de page avant" du paragraphe :
Word l'absorbe quand le titre est deja en haut d'une page, au lieu d'en
fabriquer une vide (verifie : saut en dur + attribut = 2 pages, pas 3).

Restait la queue des fichiers de contenu -- saut de page final suivi de
paragraphes vides, restes d'un montage precedent -- qui posait un paragraphe
vide seul sur une page. Elle est retiree apres insertion, sans jamais
descendre en deca de ce qui existait avant le bloc, ni toucher un paragraphe
portant un tableau, une image ou une ancre.

Sur le cas minimal : 4 pages avant, 3 apres. Sur l'exemple complet : memes 44
images, texte et tableaux intacts, 13 sauts de page ramenes a 2.

Co-Authored-By: Claude Opus 5 <noreply@anthropic.com>
</commit_message>
<xml_diff>
--- a/resources/exemple/Gabarit.docx
+++ b/resources/exemple/Gabarit.docx
@@ -134,7 +134,7 @@
               <w:bCs/>
               <w:noProof/>
             </w:rPr>
-            <w:t>1</w:t>
+            <w:t>0</w:t>
           </w:r>
           <w:r>
             <w:rPr>
@@ -287,10 +287,10 @@
         <w:lang w:eastAsia="fr-FR"/>
       </w:rPr>
       <w:drawing>
-        <wp:inline distT="0" distB="0" distL="0" distR="0" wp14:anchorId="55F5EE50" wp14:editId="719FAA25">
+        <wp:inline distT="0" distB="0" distL="0" distR="0" wp14:anchorId="3E489D1F" wp14:editId="2F7CD29E">
           <wp:extent cx="504000" cy="504000"/>
           <wp:effectExtent l="0" t="0" r="0" b="0"/>
-          <wp:docPr id="1" name="Image 1"/>
+          <wp:docPr id="2" name="Image 2"/>
           <wp:cNvGraphicFramePr>
             <a:graphicFrameLocks xmlns:a="http://schemas.openxmlformats.org/drawingml/2006/main" noChangeAspect="1"/>
           </wp:cNvGraphicFramePr>
@@ -298,7 +298,7 @@
             <a:graphicData uri="http://schemas.openxmlformats.org/drawingml/2006/picture">
               <pic:pic xmlns:pic="http://schemas.openxmlformats.org/drawingml/2006/picture">
                 <pic:nvPicPr>
-                  <pic:cNvPr id="1" name=""/>
+                  <pic:cNvPr id="2" name=""/>
                   <pic:cNvPicPr/>
                 </pic:nvPicPr>
                 <pic:blipFill>
@@ -4431,7 +4431,7 @@
 </file>
 
 <file path=customXml/itemProps2.xml><?xml version="1.0" encoding="utf-8"?>
-<ds:datastoreItem xmlns:ds="http://schemas.openxmlformats.org/officeDocument/2006/customXml" ds:itemID="{34AC0C26-CE0F-40F6-A6EE-47A48F365A66}">
+<ds:datastoreItem xmlns:ds="http://schemas.openxmlformats.org/officeDocument/2006/customXml" ds:itemID="{D2BFD3B2-E43C-4946-8444-3ACEF1A8E5B5}">
   <ds:schemaRefs>
     <ds:schemaRef ds:uri="http://schemas.openxmlformats.org/officeDocument/2006/bibliography"/>
   </ds:schemaRefs>

</xml_diff>

<commit_message>
Figer le modele en cours comme modele livre
Plan, 40 contenus et gabarit repris du dossier de travail. Le gabarit part
avec le logo XSPro, pas avec celui du poste.

Contenu encore personnalise : la depersonnalisation viendra apres les essais
chez le client test.

Verifie sur un poste simule vierge : installation automatique, generation sans
avertissement, 44 titres, 44 entrees de sommaire, 45 images, logo en en-tete.

Co-Authored-By: Claude Opus 5 <noreply@anthropic.com>
</commit_message>
<xml_diff>
--- a/resources/exemple/Gabarit.docx
+++ b/resources/exemple/Gabarit.docx
@@ -287,7 +287,7 @@
         <w:lang w:eastAsia="fr-FR"/>
       </w:rPr>
       <w:drawing>
-        <wp:inline distT="0" distB="0" distL="0" distR="0" wp14:anchorId="3E489D1F" wp14:editId="2F7CD29E">
+        <wp:inline distT="0" distB="0" distL="0" distR="0" wp14:anchorId="77245CB6" wp14:editId="726990AE">
           <wp:extent cx="504000" cy="504000"/>
           <wp:effectExtent l="0" t="0" r="0" b="0"/>
           <wp:docPr id="2" name="Image 2"/>
@@ -4431,7 +4431,7 @@
 </file>
 
 <file path=customXml/itemProps2.xml><?xml version="1.0" encoding="utf-8"?>
-<ds:datastoreItem xmlns:ds="http://schemas.openxmlformats.org/officeDocument/2006/customXml" ds:itemID="{D2BFD3B2-E43C-4946-8444-3ACEF1A8E5B5}">
+<ds:datastoreItem xmlns:ds="http://schemas.openxmlformats.org/officeDocument/2006/customXml" ds:itemID="{B75C2676-9C1D-4586-ACB4-4151D817D01C}">
   <ds:schemaRefs>
     <ds:schemaRef ds:uri="http://schemas.openxmlformats.org/officeDocument/2006/bibliography"/>
   </ds:schemaRefs>

</xml_diff>

<commit_message>
Elargit les marges du gabarit livre a 2 cm
Les 1,41 cm collaient le texte au bord de la page. Ce fichier n'amorce qu'une
bibliotheque neuve : une bibliotheque existante garde son propre gabarit, a
modifier dans Word ou a remplacer par "Restaurer le gabarit par defaut".

Co-Authored-By: Claude Opus 5 <noreply@anthropic.com>
</commit_message>
<xml_diff>
--- a/resources/exemple/Gabarit.docx
+++ b/resources/exemple/Gabarit.docx
@@ -16,7 +16,7 @@
       <w:headerReference w:type="first" r:id="rId13"/>
       <w:footerReference w:type="first" r:id="rId14"/>
       <w:pgSz w:w="11900" w:h="16840" w:code="9"/>
-      <w:pgMar w:top="215" w:right="799" w:bottom="799" w:left="799" w:header="454" w:footer="454" w:gutter="0"/>
+      <w:pgMar w:top="215" w:right="1134" w:bottom="799" w:left="1134" w:header="454" w:footer="454" w:gutter="0"/>
       <w:pgNumType w:start="0"/>
       <w:cols w:space="283"/>
       <w:noEndnote/>
@@ -4389,7 +4389,7 @@
 </file>
 
 <file path=customXml/itemProps2.xml><?xml version="1.0" encoding="utf-8"?>
-<ds:datastoreItem xmlns:ds="http://schemas.openxmlformats.org/officeDocument/2006/customXml" ds:itemID="{9A76CB02-9F31-4B1B-9E1F-51EB5116508B}">
+<ds:datastoreItem xmlns:ds="http://schemas.openxmlformats.org/officeDocument/2006/customXml" ds:itemID="{1D1C762B-BE6F-4927-9134-D6FDE7296099}">
   <ds:schemaRefs>
     <ds:schemaRef ds:uri="http://schemas.openxmlformats.org/officeDocument/2006/bibliography"/>
   </ds:schemaRefs>

</xml_diff>